<commit_message>
Adding stage 8 + clickable refs to the report
</commit_message>
<xml_diff>
--- a/Звіт з курсової роботи Кіберспортивні турніри та гравці.docx
+++ b/Звіт з курсової роботи Кіберспортивні турніри та гравці.docx
@@ -717,7 +717,22 @@
         <w:spacing w:after="0" w:line="360" w:lineRule="auto"/>
       </w:pPr>
       <w:r>
-        <w:t xml:space="preserve">9 РЕЗУЛЬТАТИ ПОТОЧНОГО ЕТАПУ</w:t>
+        <w:t xml:space="preserve">9 АНАЛІЗ КОМПРОМІСІВ ТЕОРЕМИ CAP ТА ЗАБЕЗПЕЧЕННЯ НАДІЙНОСТІ</w:t>
+      </w:r>
+      <w:r>
+        <w:tab/>
+      </w:r>
+    </w:p>
+    <w:p>
+      <w:pPr>
+        <w:pStyle w:val="12"/>
+        <w:tabs>
+          <w:tab w:val="right" w:leader="dot" w:pos="9071"/>
+        </w:tabs>
+        <w:spacing w:after="0" w:line="360" w:lineRule="auto"/>
+      </w:pPr>
+      <w:r>
+        <w:t xml:space="preserve">10 РЕЗУЛЬТАТИ ПОТОЧНОГО ЕТАПУ</w:t>
       </w:r>
       <w:r>
         <w:tab/>
@@ -1301,10 +1316,12 @@
         <w:keepNext/>
         <w:pageBreakBefore/>
       </w:pPr>
+      <w:bookmarkStart w:id="900" w:name="_Ref_sec4_3"/>
       <w:r>
         <w:lastRenderedPageBreak/>
         <w:t>4.3 Сховища та розподіл даних</w:t>
       </w:r>
+      <w:bookmarkEnd w:id="900"/>
     </w:p>
     <w:p>
       <w:pPr>
@@ -1957,7 +1974,15 @@
         <w:jc w:val="both"/>
       </w:pPr>
       <w:r>
-        <w:t>Архітектурну декомпозицію класів, портів, адаптерів та їхніх взаємозв'язків подано на схемі зв’язків класів та модулів (рис. 2).</w:t>
+        <w:t xml:space="preserve">Архітектурну декомпозицію класів, портів, адаптерів та їхніх взаємозв'язків подано на схемі зв’язків класів та модулів (</w:t>
+      </w:r>
+      <w:hyperlink w:anchor="_Ref_fig2" w:history="1">
+        <w:r>
+          <w:t xml:space="preserve">рис. 2</w:t>
+        </w:r>
+      </w:hyperlink>
+      <w:r>
+        <w:t xml:space="preserve">).</w:t>
       </w:r>
     </w:p>
     <w:p>
@@ -2024,9 +2049,11 @@
         <w:spacing w:after="0" w:line="360" w:lineRule="auto"/>
         <w:jc w:val="center"/>
       </w:pPr>
+      <w:bookmarkStart w:id="904" w:name="_Ref_fig2"/>
       <w:r>
         <w:t xml:space="preserve">Рис. 2 Архітектурна схема зв’язків класів та модулів (Станом на: 03.10.2026)</w:t>
       </w:r>
+      <w:bookmarkEnd w:id="904"/>
     </w:p>
     <w:p>
       <w:pPr>
@@ -2195,7 +2222,15 @@
         <w:jc w:val="both"/>
       </w:pPr>
       <w:r>
-        <w:t xml:space="preserve">Обґрунтування: Графова модель дозволяє компактно формулювати мовою Cypher запити про спільні виступи, суперників і найкоротші ланцюги зв’язків між гравцями. За поточного обсягу даних такі запити реалізовні й у PostgreSQL рекурсивними запитами; доцільність вибору Neo4j розглянуто в розділі 8.</w:t>
+        <w:t xml:space="preserve">Обґрунтування: Графова модель дозволяє компактно формулювати мовою Cypher запити про спільні виступи, суперників і найкоротші ланцюги зв’язків між гравцями. За поточного обсягу даних такі запити реалізовні й у PostgreSQL рекурсивними запитами; доцільність вибору Neo4j розглянуто в </w:t>
+      </w:r>
+      <w:hyperlink w:anchor="_Ref_sec8" w:history="1">
+        <w:r>
+          <w:t xml:space="preserve">розділі 8</w:t>
+        </w:r>
+      </w:hyperlink>
+      <w:r>
+        <w:t xml:space="preserve">.</w:t>
       </w:r>
     </w:p>
     <w:p>
@@ -2467,7 +2502,15 @@
         </m:r>
       </m:oMath>
       <w:r>
-        <w:t xml:space="preserve">): Три ізольовані шарди, кожен із яких розгортається як набір реплік (Replica Set). У базовому локальному профілі набір складається з одного вузла й не забезпечує відмовостійкості; профіль із трьома репліками на кожен шард описано в розділі 4.3.</w:t>
+        <w:t xml:space="preserve">): Три ізольовані шарди, кожен із яких розгортається як набір реплік (Replica Set). У базовому локальному профілі набір складається з одного вузла й не забезпечує відмовостійкості; профіль із трьома репліками на кожен шард описано в </w:t>
+      </w:r>
+      <w:hyperlink w:anchor="_Ref_sec4_3" w:history="1">
+        <w:r>
+          <w:t xml:space="preserve">розділі 4.3</w:t>
+        </w:r>
+      </w:hyperlink>
+      <w:r>
+        <w:t xml:space="preserve">.</w:t>
       </w:r>
     </w:p>
     <w:p>
@@ -3470,7 +3513,15 @@
         <w:jc w:val="both"/>
       </w:pPr>
       <w:r>
-        <w:t xml:space="preserve">Загальну взаємодію клієнтських вебінтерфейсів, конвеєра імпорту та розподіленого поліглотного сховища подано на фінальній схемі взаємодії елементів системи (рис. 3).</w:t>
+        <w:t xml:space="preserve">Загальну взаємодію клієнтських вебінтерфейсів, конвеєра імпорту та розподіленого поліглотного сховища подано на фінальній схемі взаємодії елементів системи (</w:t>
+      </w:r>
+      <w:hyperlink w:anchor="_Ref_fig3" w:history="1">
+        <w:r>
+          <w:t xml:space="preserve">рис. 3</w:t>
+        </w:r>
+      </w:hyperlink>
+      <w:r>
+        <w:t xml:space="preserve">).</w:t>
       </w:r>
     </w:p>
     <w:p>
@@ -3538,9 +3589,11 @@
         <w:ind w:firstLine="709"/>
         <w:jc w:val="center"/>
       </w:pPr>
+      <w:bookmarkStart w:id="905" w:name="_Ref_fig3"/>
       <w:r>
         <w:t>Рис. 3 Фінальна схема взаємодії елементів розподіленої системи (Станом на: 03.10.2026))</w:t>
       </w:r>
+      <w:bookmarkEnd w:id="905"/>
     </w:p>
     <w:p>
       <w:pPr>
@@ -3844,6 +3897,7 @@
       <w:pPr>
         <w:pStyle w:val="1"/>
       </w:pPr>
+      <w:bookmarkStart w:id="901" w:name="_Ref_sec7"/>
       <w:r>
         <w:rPr>
           <w:lang w:val="ru-UA"/>
@@ -3854,6 +3908,7 @@
       <w:r>
         <w:t>ОБГРУНТУВАННЯ ТЕХНОЛОГІЙ КОНТЕЙНЕРИЗАЦІЇ ТА АРХІТЕКТУРИ РОЗГОРТАННЯ</w:t>
       </w:r>
+      <w:bookmarkEnd w:id="901"/>
     </w:p>
     <w:p/>
     <w:p/>
@@ -6258,9 +6313,11 @@
         <w:pageBreakBefore/>
         <w:spacing w:after="0" w:line="360" w:lineRule="auto"/>
       </w:pPr>
+      <w:bookmarkStart w:id="902" w:name="_Ref_sec8"/>
       <w:r>
         <w:t xml:space="preserve">8 АНАЛІЗ ЗАДОВОЛЕННЯ ПОТРЕБ РОБОТИ ЗАСОБАМИ RDBMS ТА NOSQL</w:t>
       </w:r>
+      <w:bookmarkEnd w:id="902"/>
     </w:p>
     <w:p>
       <w:pPr>
@@ -6274,7 +6331,15 @@
         <w:jc w:val="both"/>
       </w:pPr>
       <w:r>
-        <w:t xml:space="preserve">Система працює з різними за природою даними: структурованими змагальними фактами, великим корпусом текстових документів і похідними представленнями для пошуку, аналізу зв’язків та кешування. Жоден клас СУБД не задовольняє всі ці потреби однаково добре, тому обрано комбінований підхід. Він є компромісом між цілісністю даних, продуктивністю та складністю експлуатації. Кожен факт має одного власника. Авторитетними сховищами є PostgreSQL і MongoDB, а решта сховищ містить похідні дані, які можна відновити. Аналіз стосується цільової архітектури: на поточному етапі розгорнуто лише PostgreSQL (розділ 7).</w:t>
+        <w:t xml:space="preserve">Система працює з різними за природою даними: структурованими змагальними фактами, великим корпусом текстових документів і похідними представленнями для пошуку, аналізу зв’язків та кешування. Жоден клас СУБД не задовольняє всі ці потреби однаково добре, тому обрано комбінований підхід. Він є компромісом між цілісністю даних, продуктивністю та складністю експлуатації. Кожен факт має одного власника. Авторитетними сховищами є PostgreSQL і MongoDB, а решта сховищ містить похідні дані, які можна відновити. Аналіз стосується цільової архітектури: на поточному етапі розгорнуто лише PostgreSQL (</w:t>
+      </w:r>
+      <w:hyperlink w:anchor="_Ref_sec7" w:history="1">
+        <w:r>
+          <w:t xml:space="preserve">розділ 7</w:t>
+        </w:r>
+      </w:hyperlink>
+      <w:r>
+        <w:t xml:space="preserve">).</w:t>
       </w:r>
     </w:p>
     <w:p>
@@ -6324,7 +6389,15 @@
         <w:jc w:val="both"/>
       </w:pPr>
       <w:r>
-        <w:t xml:space="preserve">Neo4j зберігає похідний граф зв’язків між гравцями та командами. За поточного обсягу даних (1 398 гравців) такі запити можна виконати й у PostgreSQL рекурсивними запитами. Тому Neo4j не подається як об’єктивно кращий вибір. Це спроба реалізувати цікавішу архітектуру з окремою графовою моделлю, а також урахування додаткових балів за використання більше трьох технологій баз даних.</w:t>
+        <w:t xml:space="preserve">Neo4j зберігає похідний граф зв’язків між гравцями та командами. За поточного обсягу даних (1 398 гравців) такі запити можна виконати й у PostgreSQL рекурсивними запитами. Тому Neo4j не подається як об’єктивно кращий вибір. Це спроба реалізувати цікавішу архітектуру з окремою графовою моделлю, а також урахування додаткових балів за використання більше трьох технологій баз даних. Результати зіставлення наведено в </w:t>
+      </w:r>
+      <w:hyperlink w:anchor="_Ref_tab8_1" w:history="1">
+        <w:r>
+          <w:t xml:space="preserve">табл. 8.1</w:t>
+        </w:r>
+      </w:hyperlink>
+      <w:r>
+        <w:t xml:space="preserve">.</w:t>
       </w:r>
     </w:p>
     <w:p>
@@ -6332,9 +6405,11 @@
         <w:keepNext/>
         <w:spacing w:before="120" w:after="0" w:line="360" w:lineRule="auto"/>
       </w:pPr>
+      <w:bookmarkStart w:id="906" w:name="_Ref_tab8_1"/>
       <w:r>
         <w:t xml:space="preserve">Таблиця 8.1 – Відповідність потреб системи засобам RDBMS та NoSQL</w:t>
       </w:r>
+      <w:bookmarkEnd w:id="906"/>
     </w:p>
     <w:tbl>
       <w:tblPr>
@@ -6869,7 +6944,15 @@
         <w:jc w:val="both"/>
       </w:pPr>
       <w:r>
-        <w:t xml:space="preserve">Ціною комбінованого підходу є відсутність спільної транзакції для всіх сховищ: похідні дані оновлюються асинхронно через RabbitMQ і можуть тимчасово відставати від авторитетних. Також зростає складність розгортання та підтримки. Цей компроміс прийнято, оскільки шардоване NoSQL-сховище, повнотекстовий пошук і кешування є обов’язковими вимогами завдання.</w:t>
+        <w:t xml:space="preserve">Ціною комбінованого підходу є відсутність спільної транзакції для всіх сховищ: похідні дані оновлюються асинхронно через RabbitMQ і можуть тимчасово відставати від авторитетних. Також зростає складність розгортання та підтримки. Цей компроміс прийнято, оскільки шардоване NoSQL-сховище, повнотекстовий пошук і кешування є обов’язковими вимогами завдання. Компроміси між узгодженістю та доступністю для кожного сховища розглянуто в </w:t>
+      </w:r>
+      <w:hyperlink w:anchor="_Ref_sec9" w:history="1">
+        <w:r>
+          <w:t xml:space="preserve">розділі 9</w:t>
+        </w:r>
+      </w:hyperlink>
+      <w:r>
+        <w:t xml:space="preserve">.</w:t>
       </w:r>
     </w:p>
     <w:p>
@@ -6879,9 +6962,403 @@
         <w:pageBreakBefore/>
         <w:spacing w:after="0" w:line="360" w:lineRule="auto"/>
       </w:pPr>
+      <w:bookmarkStart w:id="903" w:name="_Ref_sec9"/>
+      <w:r>
+        <w:t xml:space="preserve">9 АНАЛІЗ КОМПРОМІСІВ ТЕОРЕМИ CAP ТА ЗАБЕЗПЕЧЕННЯ НАДІЙНОСТІ</w:t>
+      </w:r>
+      <w:bookmarkEnd w:id="903"/>
+    </w:p>
+    <w:p>
+      <w:pPr>
+        <w:spacing w:after="0" w:line="360" w:lineRule="auto"/>
+      </w:pPr>
+    </w:p>
+    <w:p>
+      <w:pPr>
+        <w:spacing w:line="360" w:lineRule="auto"/>
+        <w:ind w:firstLine="709"/>
+        <w:jc w:val="both"/>
+      </w:pPr>
+      <w:r>
+        <w:t xml:space="preserve">Розподіл даних між сховищами та їхнє призначення обґрунтовано в </w:t>
+      </w:r>
+      <w:hyperlink w:anchor="_Ref_sec8" w:history="1">
+        <w:r>
+          <w:t xml:space="preserve">розділі 8</w:t>
+        </w:r>
+      </w:hyperlink>
+      <w:r>
+        <w:t xml:space="preserve">, тому тут їх не описано повторно, а розглянуто лише компроміси за теоремою CAP. Згідно з нею, під час мережевого розділення розподілена система мусить обирати між узгодженістю та доступністю. У системі цей вибір зроблено не один раз для всієї системи, а окремо для кожного сховища відповідно до його ролі (</w:t>
+      </w:r>
+      <w:hyperlink w:anchor="_Ref_tab9_1" w:history="1">
+        <w:r>
+          <w:t xml:space="preserve">табл. 9.1</w:t>
+        </w:r>
+      </w:hyperlink>
+      <w:r>
+        <w:t xml:space="preserve">).</w:t>
+      </w:r>
+    </w:p>
+    <w:p>
+      <w:pPr>
+        <w:keepNext/>
+        <w:spacing w:before="120" w:after="0" w:line="360" w:lineRule="auto"/>
+      </w:pPr>
+      <w:bookmarkStart w:id="907" w:name="_Ref_tab9_1"/>
+      <w:r>
+        <w:t xml:space="preserve">Таблиця 9.1 – Компроміси теореми CAP за частинами системи</w:t>
+      </w:r>
+      <w:bookmarkEnd w:id="907"/>
+    </w:p>
+    <w:tbl>
+      <w:tblPr>
+        <w:tblW w:w="9071" w:type="dxa"/>
+        <w:tblBorders>
+          <w:top w:val="single" w:sz="4" w:space="0" w:color="000000"/>
+          <w:left w:val="single" w:sz="4" w:space="0" w:color="000000"/>
+          <w:bottom w:val="single" w:sz="4" w:space="0" w:color="000000"/>
+          <w:right w:val="single" w:sz="4" w:space="0" w:color="000000"/>
+          <w:insideH w:val="single" w:sz="4" w:space="0" w:color="000000"/>
+          <w:insideV w:val="single" w:sz="4" w:space="0" w:color="000000"/>
+        </w:tblBorders>
+        <w:tblLayout w:type="fixed"/>
+        <w:tblCellMar>
+          <w:left w:w="85" w:type="dxa"/>
+          <w:right w:w="85" w:type="dxa"/>
+        </w:tblCellMar>
+      </w:tblPr>
+      <w:tblGrid>
+        <w:gridCol w:w="2400"/>
+        <w:gridCol w:w="3335"/>
+        <w:gridCol w:w="3336"/>
+      </w:tblGrid>
+      <w:tr>
+        <w:trPr>
+          <w:tblHeader/>
+        </w:trPr>
+        <w:tc>
+          <w:tcPr>
+            <w:tcW w:w="2400" w:type="dxa"/>
+          </w:tcPr>
+          <w:p>
+            <w:pPr>
+              <w:spacing w:after="0" w:line="240" w:lineRule="auto"/>
+            </w:pPr>
+            <w:r>
+              <w:rPr>
+                <w:b/>
+                <w:sz w:val="24"/>
+                <w:szCs w:val="24"/>
+              </w:rPr>
+              <w:t xml:space="preserve">Частина системи</w:t>
+            </w:r>
+          </w:p>
+        </w:tc>
+        <w:tc>
+          <w:tcPr>
+            <w:tcW w:w="3335" w:type="dxa"/>
+          </w:tcPr>
+          <w:p>
+            <w:pPr>
+              <w:spacing w:after="0" w:line="240" w:lineRule="auto"/>
+            </w:pPr>
+            <w:r>
+              <w:rPr>
+                <w:b/>
+                <w:sz w:val="24"/>
+                <w:szCs w:val="24"/>
+              </w:rPr>
+              <w:t xml:space="preserve">Чим пожертвувано</w:t>
+            </w:r>
+          </w:p>
+        </w:tc>
+        <w:tc>
+          <w:tcPr>
+            <w:tcW w:w="3336" w:type="dxa"/>
+          </w:tcPr>
+          <w:p>
+            <w:pPr>
+              <w:spacing w:after="0" w:line="240" w:lineRule="auto"/>
+            </w:pPr>
+            <w:r>
+              <w:rPr>
+                <w:b/>
+                <w:sz w:val="24"/>
+                <w:szCs w:val="24"/>
+              </w:rPr>
+              <w:t xml:space="preserve">Що отримано</w:t>
+            </w:r>
+          </w:p>
+        </w:tc>
+      </w:tr>
+      <w:tr>
+        <w:tc>
+          <w:tcPr>
+            <w:tcW w:w="2400" w:type="dxa"/>
+          </w:tcPr>
+          <w:p>
+            <w:pPr>
+              <w:spacing w:after="0" w:line="240" w:lineRule="auto"/>
+            </w:pPr>
+            <w:r>
+              <w:rPr>
+                <w:sz w:val="24"/>
+                <w:szCs w:val="24"/>
+              </w:rPr>
+              <w:t xml:space="preserve">PostgreSQL</w:t>
+            </w:r>
+          </w:p>
+        </w:tc>
+        <w:tc>
+          <w:tcPr>
+            <w:tcW w:w="3335" w:type="dxa"/>
+          </w:tcPr>
+          <w:p>
+            <w:pPr>
+              <w:spacing w:after="0" w:line="240" w:lineRule="auto"/>
+            </w:pPr>
+            <w:r>
+              <w:rPr>
+                <w:sz w:val="24"/>
+                <w:szCs w:val="24"/>
+              </w:rPr>
+              <w:t xml:space="preserve">Розподіленістю: один вузол на сервіс</w:t>
+            </w:r>
+          </w:p>
+        </w:tc>
+        <w:tc>
+          <w:tcPr>
+            <w:tcW w:w="3336" w:type="dxa"/>
+          </w:tcPr>
+          <w:p>
+            <w:pPr>
+              <w:spacing w:after="0" w:line="240" w:lineRule="auto"/>
+            </w:pPr>
+            <w:r>
+              <w:rPr>
+                <w:sz w:val="24"/>
+                <w:szCs w:val="24"/>
+              </w:rPr>
+              <w:t xml:space="preserve">Узгодженість і транзакції ACID без розподілених транзакцій</w:t>
+            </w:r>
+          </w:p>
+        </w:tc>
+      </w:tr>
+      <w:tr>
+        <w:tc>
+          <w:tcPr>
+            <w:tcW w:w="2400" w:type="dxa"/>
+          </w:tcPr>
+          <w:p>
+            <w:pPr>
+              <w:spacing w:after="0" w:line="240" w:lineRule="auto"/>
+            </w:pPr>
+            <w:r>
+              <w:rPr>
+                <w:sz w:val="24"/>
+                <w:szCs w:val="24"/>
+              </w:rPr>
+              <w:t xml:space="preserve">MongoDB</w:t>
+            </w:r>
+          </w:p>
+        </w:tc>
+        <w:tc>
+          <w:tcPr>
+            <w:tcW w:w="3335" w:type="dxa"/>
+          </w:tcPr>
+          <w:p>
+            <w:pPr>
+              <w:spacing w:after="0" w:line="240" w:lineRule="auto"/>
+            </w:pPr>
+            <w:r>
+              <w:rPr>
+                <w:sz w:val="24"/>
+                <w:szCs w:val="24"/>
+              </w:rPr>
+              <w:t xml:space="preserve">Доступністю запису під час обрання нового первинного вузла</w:t>
+            </w:r>
+          </w:p>
+        </w:tc>
+        <w:tc>
+          <w:tcPr>
+            <w:tcW w:w="3336" w:type="dxa"/>
+          </w:tcPr>
+          <w:p>
+            <w:pPr>
+              <w:spacing w:after="0" w:line="240" w:lineRule="auto"/>
+            </w:pPr>
+            <w:r>
+              <w:rPr>
+                <w:sz w:val="24"/>
+                <w:szCs w:val="24"/>
+              </w:rPr>
+              <w:t xml:space="preserve">Узгодженість: запис, підтверджений більшістю вузлів (writeConcern majority), не втрачається</w:t>
+            </w:r>
+          </w:p>
+        </w:tc>
+      </w:tr>
+      <w:tr>
+        <w:tc>
+          <w:tcPr>
+            <w:tcW w:w="2400" w:type="dxa"/>
+          </w:tcPr>
+          <w:p>
+            <w:pPr>
+              <w:spacing w:after="0" w:line="240" w:lineRule="auto"/>
+            </w:pPr>
+            <w:r>
+              <w:rPr>
+                <w:sz w:val="24"/>
+                <w:szCs w:val="24"/>
+              </w:rPr>
+              <w:t xml:space="preserve">Elasticsearch, Neo4j, аналітичні таблиці</w:t>
+            </w:r>
+          </w:p>
+        </w:tc>
+        <w:tc>
+          <w:tcPr>
+            <w:tcW w:w="3335" w:type="dxa"/>
+          </w:tcPr>
+          <w:p>
+            <w:pPr>
+              <w:spacing w:after="0" w:line="240" w:lineRule="auto"/>
+            </w:pPr>
+            <w:r>
+              <w:rPr>
+                <w:sz w:val="24"/>
+                <w:szCs w:val="24"/>
+              </w:rPr>
+              <w:t xml:space="preserve">Узгодженістю: дані оновлюються асинхронно й можуть відставати</w:t>
+            </w:r>
+          </w:p>
+        </w:tc>
+        <w:tc>
+          <w:tcPr>
+            <w:tcW w:w="3336" w:type="dxa"/>
+          </w:tcPr>
+          <w:p>
+            <w:pPr>
+              <w:spacing w:after="0" w:line="240" w:lineRule="auto"/>
+            </w:pPr>
+            <w:r>
+              <w:rPr>
+                <w:sz w:val="24"/>
+                <w:szCs w:val="24"/>
+              </w:rPr>
+              <w:t xml:space="preserve">Доступність і швидкість читання незалежно від стану авторитетних сховищ</w:t>
+            </w:r>
+          </w:p>
+        </w:tc>
+      </w:tr>
+      <w:tr>
+        <w:tc>
+          <w:tcPr>
+            <w:tcW w:w="2400" w:type="dxa"/>
+          </w:tcPr>
+          <w:p>
+            <w:pPr>
+              <w:spacing w:after="0" w:line="240" w:lineRule="auto"/>
+            </w:pPr>
+            <w:r>
+              <w:rPr>
+                <w:sz w:val="24"/>
+                <w:szCs w:val="24"/>
+              </w:rPr>
+              <w:t xml:space="preserve">Redis</w:t>
+            </w:r>
+          </w:p>
+        </w:tc>
+        <w:tc>
+          <w:tcPr>
+            <w:tcW w:w="3335" w:type="dxa"/>
+          </w:tcPr>
+          <w:p>
+            <w:pPr>
+              <w:spacing w:after="0" w:line="240" w:lineRule="auto"/>
+            </w:pPr>
+            <w:r>
+              <w:rPr>
+                <w:sz w:val="24"/>
+                <w:szCs w:val="24"/>
+              </w:rPr>
+              <w:t xml:space="preserve">Узгодженістю в межах часу життя запису кешу</w:t>
+            </w:r>
+          </w:p>
+        </w:tc>
+        <w:tc>
+          <w:tcPr>
+            <w:tcW w:w="3336" w:type="dxa"/>
+          </w:tcPr>
+          <w:p>
+            <w:pPr>
+              <w:spacing w:after="0" w:line="240" w:lineRule="auto"/>
+            </w:pPr>
+            <w:r>
+              <w:rPr>
+                <w:sz w:val="24"/>
+                <w:szCs w:val="24"/>
+              </w:rPr>
+              <w:t xml:space="preserve">Мінімальна затримка; за недоступності кешу дані читаються з основного сховища</w:t>
+            </w:r>
+          </w:p>
+        </w:tc>
+      </w:tr>
+    </w:tbl>
+    <w:p>
+      <w:pPr>
+        <w:spacing w:after="0" w:line="360" w:lineRule="auto"/>
+      </w:pPr>
+    </w:p>
+    <w:p>
+      <w:pPr>
+        <w:spacing w:line="360" w:lineRule="auto"/>
+        <w:ind w:firstLine="709"/>
+        <w:jc w:val="both"/>
+      </w:pPr>
+      <w:r>
+        <w:t xml:space="preserve">Жертва в одному місці компенсується в іншому. Тимчасова недоступність запису в MongoDB не зупиняє приймання даних: ingestion_service продовжує публікувати пакети, RabbitMQ накопичує їх у черзі, а content_service записує їх після відновлення. Відставання пошуку й аналітики компенсується відображенням часу оновлення та покриття даних в інтерфейсі. Лічильники збережених документів на панелі моніторингу, навпаки, читаються з первинних вузлів MongoDB, оскільки для демонстрації швидкості запису точність важливіша за доступність.</w:t>
+      </w:r>
+    </w:p>
+    <w:p>
+      <w:pPr>
+        <w:spacing w:line="360" w:lineRule="auto"/>
+        <w:ind w:firstLine="709"/>
+        <w:jc w:val="both"/>
+      </w:pPr>
+      <w:r>
+        <w:t xml:space="preserve">Навіть за відсутності розділення система обирає між затримкою та узгодженістю (розширення CAP, відоме як PACELC): кеш і асинхронні проєкції зменшують час відповіді ціною тимчасового відставання даних.</w:t>
+      </w:r>
+    </w:p>
+    <w:p>
+      <w:pPr>
+        <w:spacing w:line="360" w:lineRule="auto"/>
+        <w:ind w:firstLine="709"/>
+        <w:jc w:val="both"/>
+      </w:pPr>
+      <w:r>
+        <w:t xml:space="preserve">Надійність зберігання забезпечують такі механізми. Transactional outbox фіксує зміну даних і подію для інших сервісів в одній транзакції. Доставка повідомлень є щонайменше одноразовою, а обробка ідемпотентною завдяки стабільним ідентифікаторам повідомлень, пакетів і документів. Версії сутностей не дозволяють застарілим подіям перезаписати новіші дані. Повідомлення з постійними помилками переносяться до окремої черги для аналізу, а перерваний імпорт продовжується з контрольної точки. Резервного копіювання потребують лише PostgreSQL і MongoDB, решта сховищ перебудовується з них.</w:t>
+      </w:r>
+    </w:p>
+    <w:p>
+      <w:pPr>
+        <w:spacing w:line="360" w:lineRule="auto"/>
+        <w:ind w:firstLine="709"/>
+        <w:jc w:val="both"/>
+      </w:pPr>
+      <w:r>
+        <w:t xml:space="preserve">Кожен шард MongoDB розгортається як набір реплік. У базовому профілі набір складається з одного вузла: дані розподілено між шардами, але автоматичного перемикання за відмови вузла немає. Профіль із трьома вузлами на кожен шард забезпечує таке перемикання й розглядається як додаткова мета роботи: за демонстрацію реплікації завданням передбачено до 10 додаткових балів. Наведений аналіз описує цільову архітектуру: поточний стенд працює на одній машині, де мережеве розділення практично не виникає.</w:t>
+      </w:r>
+    </w:p>
+    <w:p>
+      <w:pPr>
+        <w:pStyle w:val="1"/>
+        <w:keepNext/>
+        <w:pageBreakBefore/>
+        <w:spacing w:after="0" w:line="360" w:lineRule="auto"/>
+      </w:pPr>
       <w:r>
         <w:lastRenderedPageBreak/>
-        <w:t xml:space="preserve">9 РЕЗУЛЬТАТИ ПОТОЧНОГО ЕТАПУ</w:t>
+        <w:t xml:space="preserve">10 РЕЗУЛЬТАТИ ПОТОЧНОГО ЕТАПУ</w:t>
       </w:r>
     </w:p>
     <w:p>
@@ -6966,7 +7443,33 @@
         <w:jc w:val="both"/>
       </w:pPr>
       <w:r>
-        <w:t xml:space="preserve">У межах сьомого етапу проаналізовано відповідність потреб системи можливостям реляційних і NoSQL-сховищ (розділ 8). Обґрунтовано комбінований підхід: PostgreSQL для структурованих змагальних даних і стану сервісів, MongoDB для шардованого текстового корпусу, Elasticsearch для повнотекстового пошуку, Redis для кешування та Neo4j як додаткове рішення для аналізу зв’язків.</w:t>
+        <w:t xml:space="preserve">У межах сьомого етапу проаналізовано відповідність потреб системи можливостям реляційних і NoSQL-сховищ (</w:t>
+      </w:r>
+      <w:hyperlink w:anchor="_Ref_sec8" w:history="1">
+        <w:r>
+          <w:t xml:space="preserve">розділ 8</w:t>
+        </w:r>
+      </w:hyperlink>
+      <w:r>
+        <w:t xml:space="preserve">). Обґрунтовано комбінований підхід: PostgreSQL для структурованих змагальних даних і стану сервісів, MongoDB для шардованого текстового корпусу, Elasticsearch для повнотекстового пошуку, Redis для кешування та Neo4j як додаткове рішення для аналізу зв’язків.</w:t>
+      </w:r>
+    </w:p>
+    <w:p>
+      <w:pPr>
+        <w:spacing w:line="360" w:lineRule="auto"/>
+        <w:ind w:firstLine="709"/>
+        <w:jc w:val="both"/>
+      </w:pPr>
+      <w:r>
+        <w:t xml:space="preserve">У межах восьмого етапу проаналізовано компроміси теореми CAP для кожного сховища системи та механізми забезпечення надійності зберігання даних (</w:t>
+      </w:r>
+      <w:hyperlink w:anchor="_Ref_sec9" w:history="1">
+        <w:r>
+          <w:t xml:space="preserve">розділ 9</w:t>
+        </w:r>
+      </w:hyperlink>
+      <w:r>
+        <w:t xml:space="preserve">).</w:t>
       </w:r>
     </w:p>
     <w:sectPr>

</xml_diff>